<commit_message>
Remove Tang price screenshot
</commit_message>
<xml_diff>
--- a/applications/2026/Q2/TangPrimer25K雷达LVDS采集FPGA/申报书.docx
+++ b/applications/2026/Q2/TangPrimer25K雷达LVDS采集FPGA/申报书.docx
@@ -31,9 +31,8 @@
       <w:r>
         <w:rPr>
           <w:rFonts w:ascii="Times New Roman" w:hAnsi="Times New Roman" w:eastAsia="宋体"/>
-          <w:b w:val="0"/>
         </w:rPr>
-        <w:t>雷达 LVDS 原始数据采集涉及高速并行数据、帧同步、时序约束和缓存链路，直接在自研采集卡上调试风险较高。需要一套低成本 FPGA 开发板先验证 LVDS 接收、解串和测试向量逻辑，为自研 1Gbps USB3.0 雷达采集卡降低调试风险。</w:t>
+        <w:t>雷达 LVDS 原始数据采集涉及高速并行数据、帧同步、时序约束和缓存链路。直接在采集卡上集成 FPGA 芯片成功率较低，因此需要先使用现有 FPGA 核心板贴合验证 LVDS 接收、解串、测试向量和缓存策略，为自研 1Gbps USB3.0 雷达采集卡形成可复用的前端逻辑和接口方案。</w:t>
       </w:r>
     </w:p>
     <w:p>
@@ -146,7 +145,7 @@
           <w:p>
             <w:r>
               <w:rPr>
-                <w:rFonts w:ascii="Times New Roman" w:hAnsi="Times New Roman" w:eastAsia="黑体"/>
+                <w:rFonts w:ascii="Times New Roman" w:hAnsi="Times New Roman" w:eastAsia="宋体"/>
                 <w:b/>
                 <w:sz w:val="16"/>
               </w:rPr>
@@ -161,7 +160,7 @@
           <w:p>
             <w:r>
               <w:rPr>
-                <w:rFonts w:ascii="Times New Roman" w:hAnsi="Times New Roman" w:eastAsia="黑体"/>
+                <w:rFonts w:ascii="Times New Roman" w:hAnsi="Times New Roman" w:eastAsia="宋体"/>
                 <w:b/>
                 <w:sz w:val="16"/>
               </w:rPr>
@@ -176,7 +175,7 @@
           <w:p>
             <w:r>
               <w:rPr>
-                <w:rFonts w:ascii="Times New Roman" w:hAnsi="Times New Roman" w:eastAsia="黑体"/>
+                <w:rFonts w:ascii="Times New Roman" w:hAnsi="Times New Roman" w:eastAsia="宋体"/>
                 <w:b/>
                 <w:sz w:val="16"/>
               </w:rPr>
@@ -191,7 +190,7 @@
           <w:p>
             <w:r>
               <w:rPr>
-                <w:rFonts w:ascii="Times New Roman" w:hAnsi="Times New Roman" w:eastAsia="黑体"/>
+                <w:rFonts w:ascii="Times New Roman" w:hAnsi="Times New Roman" w:eastAsia="宋体"/>
                 <w:b/>
                 <w:sz w:val="16"/>
               </w:rPr>
@@ -206,7 +205,7 @@
           <w:p>
             <w:r>
               <w:rPr>
-                <w:rFonts w:ascii="Times New Roman" w:hAnsi="Times New Roman" w:eastAsia="黑体"/>
+                <w:rFonts w:ascii="Times New Roman" w:hAnsi="Times New Roman" w:eastAsia="宋体"/>
                 <w:b/>
                 <w:sz w:val="16"/>
               </w:rPr>
@@ -289,8 +288,9 @@
             <w:r>
               <w:rPr>
                 <w:rFonts w:ascii="Times New Roman" w:hAnsi="Times New Roman" w:eastAsia="宋体"/>
+                <w:sz w:val="16"/>
               </w:rPr>
-              <w:t>当前记录价，核心板 + 25K Dock 套件</w:t>
+              <w:t>当前记录价，核心板 + 25K Dock 套件；后续以下单页复核</w:t>
             </w:r>
           </w:p>
         </w:tc>
@@ -367,6 +367,7 @@
             <w:r>
               <w:rPr>
                 <w:rFonts w:ascii="Times New Roman" w:hAnsi="Times New Roman" w:eastAsia="宋体"/>
+                <w:sz w:val="16"/>
               </w:rPr>
               <w:t>实际以审批后订单及发票为准</w:t>
             </w:r>
@@ -446,15 +447,6 @@
           <w:b/>
         </w:rPr>
         <w:t>图片凭证：</w:t>
-      </w:r>
-    </w:p>
-    <w:p>
-      <w:r>
-        <w:rPr>
-          <w:rFonts w:ascii="Times New Roman" w:hAnsi="Times New Roman" w:eastAsia="宋体"/>
-          <w:b w:val="0"/>
-        </w:rPr>
-        <w:t>淘宝价格截图</w:t>
       </w:r>
     </w:p>
     <w:p>

</xml_diff>

<commit_message>
Add radar acquisition card preview
</commit_message>
<xml_diff>
--- a/applications/2026/Q2/TangPrimer25K雷达LVDS采集FPGA/申报书.docx
+++ b/applications/2026/Q2/TangPrimer25K雷达LVDS采集FPGA/申报书.docx
@@ -575,6 +575,50 @@
         </w:drawing>
       </w:r>
     </w:p>
+    <w:p>
+      <w:r>
+        <w:rPr>
+          <w:rFonts w:ascii="Times New Roman" w:hAnsi="Times New Roman" w:eastAsia="宋体"/>
+        </w:rPr>
+        <w:t>雷达采集卡实物预览图</w:t>
+      </w:r>
+    </w:p>
+    <w:p>
+      <w:r>
+        <w:drawing>
+          <wp:inline xmlns:a="http://schemas.openxmlformats.org/drawingml/2006/main" xmlns:pic="http://schemas.openxmlformats.org/drawingml/2006/picture">
+            <wp:extent cx="4937760" cy="6583680"/>
+            <wp:docPr id="4" name="Picture 4"/>
+            <wp:cNvGraphicFramePr>
+              <a:graphicFrameLocks noChangeAspect="1"/>
+            </wp:cNvGraphicFramePr>
+            <a:graphic>
+              <a:graphicData uri="http://schemas.openxmlformats.org/drawingml/2006/picture">
+                <pic:pic>
+                  <pic:nvPicPr>
+                    <pic:cNvPr id="0" name="radar-acquisition-card-preview.jpg"/>
+                    <pic:cNvPicPr/>
+                  </pic:nvPicPr>
+                  <pic:blipFill>
+                    <a:blip r:embed="rId12"/>
+                    <a:stretch>
+                      <a:fillRect/>
+                    </a:stretch>
+                  </pic:blipFill>
+                  <pic:spPr>
+                    <a:xfrm>
+                      <a:off x="0" y="0"/>
+                      <a:ext cx="4937760" cy="6583680"/>
+                    </a:xfrm>
+                    <a:prstGeom prst="rect"/>
+                  </pic:spPr>
+                </pic:pic>
+              </a:graphicData>
+            </a:graphic>
+          </wp:inline>
+        </w:drawing>
+      </w:r>
+    </w:p>
     <w:sectPr>
       <w:pgSz w:w="12240" w:h="15840"/>
       <w:pgMar w:top="1440" w:right="1800" w:bottom="1440" w:left="1800" w:header="720" w:footer="720" w:gutter="0"/>

</xml_diff>